<commit_message>
Make stochastic replication platform-stable
</commit_message>
<xml_diff>
--- a/paper/Therapeutic_Economies_Preprint.docx
+++ b/paper/Therapeutic_Economies_Preprint.docx
@@ -1741,7 +1741,7 @@
           <w:color w:val="000000"/>
           <w:sz w:val="21"/>
         </w:rPr>
-        <w:t>The initial protection-seeking share is 0.30 and initial capability is 0.62. Two hundred seeds are run for every scenario-model pair. Seeds drive declared Gaussian payoff and capability shocks. Because Python's standard pseudorandom generator and every parameter are committed in the repository, the experiment is exactly reproducible in the tested environment without external data or packages.</w:t>
+        <w:t>The initial protection-seeking share is 0.30 and initial capability is 0.62. Two hundred seeds are run for every scenario-model pair. Seeds drive declared payoff and capability shocks. Each shock is an Irwin-Hall approximation constructed from twelve SHA-256-derived uniforms. This avoids platform-dependent Gaussian pseudorandom implementations. Every parameter is committed, so the experiment is exactly reproducible in the tested environment without external data or packages.</w:t>
       </w:r>
     </w:p>
     <w:p>
@@ -1855,7 +1855,7 @@
           <w:color w:val="000000"/>
           <w:sz w:val="21"/>
         </w:rPr>
-        <w:t>Under unconditional protection with endogenous capability, the mean final protection-seeking share is 0.989 and mean final capability is 0.007. All 200 runs satisfy the inversion diagnostic. In the fixed-capability baseline, the share also rises, to 0.954, but capability remains at 0.620 by construction and inversion is therefore absent. This comparison shows why a strategy-only model misses part of the proposed mechanism: protection can change not only which strategy is frequent but also the stock on which subsequent productive adaptation depends.</w:t>
+        <w:t>Under unconditional protection with endogenous capability, the mean final protection-seeking share is 0.989 and mean final capability is 0.008. All 200 runs satisfy the inversion diagnostic. In the fixed-capability baseline, the share also rises, to 0.954, but capability remains at 0.620 by construction and inversion is therefore absent. This comparison shows why a strategy-only model misses part of the proposed mechanism: protection can change not only which strategy is frequent but also the stock on which subsequent productive adaptation depends.</w:t>
       </w:r>
     </w:p>
     <w:p>
@@ -2081,7 +2081,7 @@
                 <w:color w:val="000000"/>
                 <w:sz w:val="17"/>
               </w:rPr>
-              <w:t>0.9894</w:t>
+              <w:t>0.9893</w:t>
             </w:r>
           </w:p>
         </w:tc>
@@ -2102,7 +2102,7 @@
                 <w:color w:val="000000"/>
                 <w:sz w:val="17"/>
               </w:rPr>
-              <w:t>0.0075</w:t>
+              <w:t>0.0078</w:t>
             </w:r>
           </w:p>
         </w:tc>
@@ -2123,7 +2123,7 @@
                 <w:color w:val="000000"/>
                 <w:sz w:val="17"/>
               </w:rPr>
-              <w:t>51.50</w:t>
+              <w:t>51.49</w:t>
             </w:r>
           </w:p>
         </w:tc>
@@ -2209,7 +2209,7 @@
                 <w:color w:val="000000"/>
                 <w:sz w:val="17"/>
               </w:rPr>
-              <w:t>0.9536</w:t>
+              <w:t>0.9535</w:t>
             </w:r>
           </w:p>
         </w:tc>
@@ -2251,7 +2251,7 @@
                 <w:color w:val="000000"/>
                 <w:sz w:val="17"/>
               </w:rPr>
-              <w:t>53.87</w:t>
+              <w:t>53.84</w:t>
             </w:r>
           </w:p>
         </w:tc>
@@ -2593,7 +2593,7 @@
                 <w:color w:val="000000"/>
                 <w:sz w:val="17"/>
               </w:rPr>
-              <w:t>0.0072</w:t>
+              <w:t>0.0071</w:t>
             </w:r>
           </w:p>
         </w:tc>
@@ -2763,7 +2763,7 @@
                 <w:color w:val="000000"/>
                 <w:sz w:val="17"/>
               </w:rPr>
-              <w:t>80.04</w:t>
+              <w:t>79.60</w:t>
             </w:r>
           </w:p>
         </w:tc>

</xml_diff>